<commit_message>
modificata relazione con commento su Colab
</commit_message>
<xml_diff>
--- a/Relazione_totale.docx
+++ b/Relazione_totale.docx
@@ -870,20 +870,51 @@
     </w:p>
     <w:p>
       <w:pPr>
-        <w:pStyle w:val="StileTesi"/>
-      </w:pPr>
-      <w:r>
-        <w:t>2</w:t>
-      </w:r>
-      <w:r>
-        <w:t xml:space="preserve">. </w:t>
-      </w:r>
-      <w:r>
-        <w:t>Implementazione Sequenziale</w:t>
+        <w:spacing w:after="120"/>
+        <w:jc w:val="both"/>
+        <w:rPr>
+          <w:sz w:val="20"/>
+          <w:szCs w:val="18"/>
+        </w:rPr>
+      </w:pPr>
+      <w:r>
+        <w:rPr>
+          <w:sz w:val="20"/>
+          <w:szCs w:val="18"/>
+        </w:rPr>
+        <w:t>Tutte le analisi presentate in questa relazione sono state realizzate attraverso</w:t>
+      </w:r>
+      <w:r>
+        <w:rPr>
+          <w:sz w:val="20"/>
+          <w:szCs w:val="18"/>
+        </w:rPr>
+        <w:t xml:space="preserve"> estrapolazione di statistiche di performance, eseguendo i codici consegnati </w:t>
+      </w:r>
+      <w:r>
+        <w:rPr>
+          <w:sz w:val="20"/>
+          <w:szCs w:val="18"/>
+        </w:rPr>
+        <w:t>su Google CoLab.</w:t>
       </w:r>
     </w:p>
     <w:p>
       <w:pPr>
+        <w:pStyle w:val="StileTesi"/>
+      </w:pPr>
+      <w:r>
+        <w:t>2</w:t>
+      </w:r>
+      <w:r>
+        <w:t xml:space="preserve">. </w:t>
+      </w:r>
+      <w:r>
+        <w:t>Implementazione Sequenziale</w:t>
+      </w:r>
+    </w:p>
+    <w:p>
+      <w:pPr>
         <w:spacing w:after="120"/>
         <w:jc w:val="both"/>
         <w:rPr>
@@ -1053,7 +1084,21 @@
           <w:sz w:val="20"/>
           <w:szCs w:val="18"/>
         </w:rPr>
-        <w:t>).</w:t>
+        <w:t>)</w:t>
+      </w:r>
+      <w:r>
+        <w:rPr>
+          <w:sz w:val="20"/>
+          <w:szCs w:val="18"/>
+        </w:rPr>
+        <w:t>, aggiungendo due righe e due colonne di zeri alla griglia logica</w:t>
+      </w:r>
+      <w:r>
+        <w:rPr>
+          <w:sz w:val="20"/>
+          <w:szCs w:val="18"/>
+        </w:rPr>
+        <w:t>.</w:t>
       </w:r>
     </w:p>
     <w:p>
@@ -1554,7 +1599,7 @@
           <w:szCs w:val="18"/>
         </w:rPr>
         <w:drawing>
-          <wp:anchor distT="0" distB="0" distL="114300" distR="114300" simplePos="0" relativeHeight="251688960" behindDoc="1" locked="0" layoutInCell="1" allowOverlap="1" wp14:anchorId="5FE60B97" wp14:editId="6B2D8649">
+          <wp:anchor distT="0" distB="0" distL="114300" distR="114300" simplePos="0" relativeHeight="251688960" behindDoc="1" locked="0" layoutInCell="1" allowOverlap="1" wp14:anchorId="5FE60B97" wp14:editId="1EDFCEF2">
             <wp:simplePos x="0" y="0"/>
             <wp:positionH relativeFrom="column">
               <wp:posOffset>-1270</wp:posOffset>
@@ -9122,7 +9167,7 @@
           <w:szCs w:val="20"/>
         </w:rPr>
         <w:drawing>
-          <wp:anchor distT="0" distB="0" distL="114300" distR="114300" simplePos="0" relativeHeight="251673600" behindDoc="0" locked="0" layoutInCell="1" allowOverlap="1" wp14:anchorId="3475BD4B" wp14:editId="1B0D6021">
+          <wp:anchor distT="0" distB="0" distL="114300" distR="114300" simplePos="0" relativeHeight="251673600" behindDoc="0" locked="0" layoutInCell="1" allowOverlap="1" wp14:anchorId="3475BD4B" wp14:editId="2B16A5B5">
             <wp:simplePos x="0" y="0"/>
             <wp:positionH relativeFrom="column">
               <wp:posOffset>-1270</wp:posOffset>
@@ -9176,7 +9221,7 @@
           <w:noProof/>
         </w:rPr>
         <w:drawing>
-          <wp:inline distT="0" distB="0" distL="0" distR="0" wp14:anchorId="6E2D5376" wp14:editId="213F78E3">
+          <wp:inline distT="0" distB="0" distL="0" distR="0" wp14:anchorId="6E2D5376" wp14:editId="3FE40EC0">
             <wp:extent cx="6120130" cy="996950"/>
             <wp:effectExtent l="0" t="0" r="0" b="0"/>
             <wp:docPr id="690654678" name="Immagine 50" descr="Immagine che contiene testo, linea, numero, Parallelo&#10;&#10;Il contenuto generato dall'IA potrebbe non essere corretto."/>
@@ -12087,7 +12132,7 @@
           <w:noProof/>
         </w:rPr>
         <w:drawing>
-          <wp:anchor distT="0" distB="0" distL="114300" distR="114300" simplePos="0" relativeHeight="251667456" behindDoc="0" locked="0" layoutInCell="1" allowOverlap="1" wp14:anchorId="4E99BB72" wp14:editId="7C7EA2FB">
+          <wp:anchor distT="0" distB="0" distL="114300" distR="114300" simplePos="0" relativeHeight="251667456" behindDoc="0" locked="0" layoutInCell="1" allowOverlap="1" wp14:anchorId="4E99BB72" wp14:editId="708BD7D6">
             <wp:simplePos x="0" y="0"/>
             <wp:positionH relativeFrom="column">
               <wp:posOffset>-1270</wp:posOffset>
@@ -17537,7 +17582,7 @@
           <w:noProof/>
         </w:rPr>
         <w:drawing>
-          <wp:inline distT="0" distB="0" distL="0" distR="0" wp14:anchorId="4A22BCE4" wp14:editId="51E5EB3F">
+          <wp:inline distT="0" distB="0" distL="0" distR="0" wp14:anchorId="4A22BCE4" wp14:editId="4FA4638C">
             <wp:extent cx="3880090" cy="2411605"/>
             <wp:effectExtent l="0" t="0" r="6350" b="8255"/>
             <wp:docPr id="1737428598" name="Immagine 31" descr="Immagine che contiene schermata, testo, diagramma, Software per la grafica&#10;&#10;Il contenuto generato dall'IA potrebbe non essere corretto."/>
@@ -19554,32 +19599,17 @@
     <w:p>
       <w:pPr>
         <w:pStyle w:val="StileTesi3"/>
-        <w:rPr>
-          <w:lang w:val="en-GB"/>
-        </w:rPr>
-      </w:pPr>
-      <w:r>
-        <w:rPr>
-          <w:lang w:val="en-GB"/>
-        </w:rPr>
+      </w:pPr>
+      <w:r>
         <w:t>5.4.</w:t>
       </w:r>
       <w:r>
-        <w:rPr>
-          <w:lang w:val="en-GB"/>
-        </w:rPr>
         <w:t>3</w:t>
       </w:r>
       <w:r>
-        <w:rPr>
-          <w:lang w:val="en-GB"/>
-        </w:rPr>
         <w:t xml:space="preserve"> </w:t>
       </w:r>
       <w:r>
-        <w:rPr>
-          <w:lang w:val="en-GB"/>
-        </w:rPr>
         <w:t>Bank Conflict in shared memory</w:t>
       </w:r>
     </w:p>
@@ -19843,7 +19873,7 @@
           <w:noProof/>
         </w:rPr>
         <w:drawing>
-          <wp:anchor distT="0" distB="0" distL="114300" distR="114300" simplePos="0" relativeHeight="251685888" behindDoc="0" locked="0" layoutInCell="1" allowOverlap="1" wp14:anchorId="082F0CD6" wp14:editId="5106723F">
+          <wp:anchor distT="0" distB="0" distL="114300" distR="114300" simplePos="0" relativeHeight="251685888" behindDoc="0" locked="0" layoutInCell="1" allowOverlap="1" wp14:anchorId="082F0CD6" wp14:editId="74392744">
             <wp:simplePos x="0" y="0"/>
             <wp:positionH relativeFrom="column">
               <wp:posOffset>713861</wp:posOffset>
@@ -22808,13 +22838,7 @@
         <w:pStyle w:val="StileTesi2"/>
       </w:pPr>
       <w:r>
-        <w:t>7.</w:t>
-      </w:r>
-      <w:r>
-        <w:t>1</w:t>
-      </w:r>
-      <w:r>
-        <w:t xml:space="preserve"> Logica kernel GPU + rendering GPU</w:t>
+        <w:t>7.1 Logica kernel GPU + rendering GPU</w:t>
       </w:r>
     </w:p>
     <w:p>
@@ -24174,7 +24198,7 @@
           <w:noProof/>
         </w:rPr>
         <w:drawing>
-          <wp:inline distT="0" distB="0" distL="0" distR="0" wp14:anchorId="5C033368" wp14:editId="738FDCA5">
+          <wp:inline distT="0" distB="0" distL="0" distR="0" wp14:anchorId="5C033368" wp14:editId="497DA53E">
             <wp:extent cx="4737640" cy="2778826"/>
             <wp:effectExtent l="0" t="0" r="6350" b="2540"/>
             <wp:docPr id="1019883301" name="Immagine 3"/>
@@ -27240,6 +27264,7 @@
   <w:style w:type="character" w:default="1" w:styleId="Carpredefinitoparagrafo">
     <w:name w:val="Default Paragraph Font"/>
     <w:uiPriority w:val="1"/>
+    <w:semiHidden/>
     <w:unhideWhenUsed/>
   </w:style>
   <w:style w:type="table" w:default="1" w:styleId="Tabellanormale">

</xml_diff>

<commit_message>
realazione finale, modifiche commenti
</commit_message>
<xml_diff>
--- a/Relazione_totale.docx
+++ b/Relazione_totale.docx
@@ -896,7 +896,14 @@
           <w:sz w:val="20"/>
           <w:szCs w:val="18"/>
         </w:rPr>
-        <w:t>su Google CoLab.</w:t>
+        <w:t>nei runtime offerti da Google Colab</w:t>
+      </w:r>
+      <w:r>
+        <w:rPr>
+          <w:sz w:val="20"/>
+          <w:szCs w:val="18"/>
+        </w:rPr>
+        <w:t>.</w:t>
       </w:r>
     </w:p>
     <w:p>
@@ -1599,7 +1606,7 @@
           <w:szCs w:val="18"/>
         </w:rPr>
         <w:drawing>
-          <wp:anchor distT="0" distB="0" distL="114300" distR="114300" simplePos="0" relativeHeight="251688960" behindDoc="1" locked="0" layoutInCell="1" allowOverlap="1" wp14:anchorId="5FE60B97" wp14:editId="1EDFCEF2">
+          <wp:anchor distT="0" distB="0" distL="114300" distR="114300" simplePos="0" relativeHeight="251688960" behindDoc="1" locked="0" layoutInCell="1" allowOverlap="1" wp14:anchorId="5FE60B97" wp14:editId="331FF7EB">
             <wp:simplePos x="0" y="0"/>
             <wp:positionH relativeFrom="column">
               <wp:posOffset>-1270</wp:posOffset>
@@ -9167,7 +9174,7 @@
           <w:szCs w:val="20"/>
         </w:rPr>
         <w:drawing>
-          <wp:anchor distT="0" distB="0" distL="114300" distR="114300" simplePos="0" relativeHeight="251673600" behindDoc="0" locked="0" layoutInCell="1" allowOverlap="1" wp14:anchorId="3475BD4B" wp14:editId="2B16A5B5">
+          <wp:anchor distT="0" distB="0" distL="114300" distR="114300" simplePos="0" relativeHeight="251673600" behindDoc="0" locked="0" layoutInCell="1" allowOverlap="1" wp14:anchorId="3475BD4B" wp14:editId="39029521">
             <wp:simplePos x="0" y="0"/>
             <wp:positionH relativeFrom="column">
               <wp:posOffset>-1270</wp:posOffset>
@@ -9221,7 +9228,7 @@
           <w:noProof/>
         </w:rPr>
         <w:drawing>
-          <wp:inline distT="0" distB="0" distL="0" distR="0" wp14:anchorId="6E2D5376" wp14:editId="3FE40EC0">
+          <wp:inline distT="0" distB="0" distL="0" distR="0" wp14:anchorId="6E2D5376" wp14:editId="6FAC1DDD">
             <wp:extent cx="6120130" cy="996950"/>
             <wp:effectExtent l="0" t="0" r="0" b="0"/>
             <wp:docPr id="690654678" name="Immagine 50" descr="Immagine che contiene testo, linea, numero, Parallelo&#10;&#10;Il contenuto generato dall'IA potrebbe non essere corretto."/>
@@ -12132,7 +12139,7 @@
           <w:noProof/>
         </w:rPr>
         <w:drawing>
-          <wp:anchor distT="0" distB="0" distL="114300" distR="114300" simplePos="0" relativeHeight="251667456" behindDoc="0" locked="0" layoutInCell="1" allowOverlap="1" wp14:anchorId="4E99BB72" wp14:editId="708BD7D6">
+          <wp:anchor distT="0" distB="0" distL="114300" distR="114300" simplePos="0" relativeHeight="251667456" behindDoc="0" locked="0" layoutInCell="1" allowOverlap="1" wp14:anchorId="4E99BB72" wp14:editId="5B0526BE">
             <wp:simplePos x="0" y="0"/>
             <wp:positionH relativeFrom="column">
               <wp:posOffset>-1270</wp:posOffset>
@@ -17582,7 +17589,7 @@
           <w:noProof/>
         </w:rPr>
         <w:drawing>
-          <wp:inline distT="0" distB="0" distL="0" distR="0" wp14:anchorId="4A22BCE4" wp14:editId="4FA4638C">
+          <wp:inline distT="0" distB="0" distL="0" distR="0" wp14:anchorId="4A22BCE4" wp14:editId="0959F47D">
             <wp:extent cx="3880090" cy="2411605"/>
             <wp:effectExtent l="0" t="0" r="6350" b="8255"/>
             <wp:docPr id="1737428598" name="Immagine 31" descr="Immagine che contiene schermata, testo, diagramma, Software per la grafica&#10;&#10;Il contenuto generato dall'IA potrebbe non essere corretto."/>
@@ -19873,7 +19880,7 @@
           <w:noProof/>
         </w:rPr>
         <w:drawing>
-          <wp:anchor distT="0" distB="0" distL="114300" distR="114300" simplePos="0" relativeHeight="251685888" behindDoc="0" locked="0" layoutInCell="1" allowOverlap="1" wp14:anchorId="082F0CD6" wp14:editId="74392744">
+          <wp:anchor distT="0" distB="0" distL="114300" distR="114300" simplePos="0" relativeHeight="251685888" behindDoc="0" locked="0" layoutInCell="1" allowOverlap="1" wp14:anchorId="082F0CD6" wp14:editId="6915EE0A">
             <wp:simplePos x="0" y="0"/>
             <wp:positionH relativeFrom="column">
               <wp:posOffset>713861</wp:posOffset>
@@ -24198,7 +24205,7 @@
           <w:noProof/>
         </w:rPr>
         <w:drawing>
-          <wp:inline distT="0" distB="0" distL="0" distR="0" wp14:anchorId="5C033368" wp14:editId="497DA53E">
+          <wp:inline distT="0" distB="0" distL="0" distR="0" wp14:anchorId="5C033368" wp14:editId="7F93EDC7">
             <wp:extent cx="4737640" cy="2778826"/>
             <wp:effectExtent l="0" t="0" r="6350" b="2540"/>
             <wp:docPr id="1019883301" name="Immagine 3"/>

</xml_diff>